<commit_message>
PHD-1: align documents with the final team PDF
</commit_message>
<xml_diff>
--- a/docs/02_Supervisor_Feedback_Record.docx
+++ b/docs/02_Supervisor_Feedback_Record.docx
@@ -7,94 +7,262 @@
         <w:pStyle w:val="Title"/>
       </w:pPr>
       <w:r>
-        <w:t>Supervisor Feedback Record</w:t>
+        <w:t>Supervisor feedback</w:t>
       </w:r>
     </w:p>
     <w:p>
-      <w:pPr>
-        <w:pStyle w:val="Heading1"/>
-      </w:pPr>
       <w:r>
-        <w:t>Project and team</w:t>
+        <w:t>PHD-1 | Requirements and MVP scope | Review record</w:t>
       </w:r>
     </w:p>
     <w:p>
       <w:r>
         <w:t>Design and Development of an Explainable Browser Extension for Real-Time Phishing Website Detection</w:t>
-        <w:br/>
-        <w:t>Aiym Pangerey, Sabina Zhumagaliyeva, Alibek Asylbekuly</w:t>
-        <w:br/>
-        <w:t>SE-2422 | Supervisor: A. A. Sakhipov</w:t>
+      </w:r>
+    </w:p>
+    <w:p>
+      <w:r>
+        <w:t>Team: Aiym Pangerey; Sabina Zhumagaliyeva; Alibek Asylbekuly | SE-2422</w:t>
+      </w:r>
+    </w:p>
+    <w:p>
+      <w:r>
+        <w:t>Supervisor: A. A. Sakhipov, PhD, Assistant Professor, School of Software Engineering</w:t>
+      </w:r>
+    </w:p>
+    <w:p>
+      <w:r>
+        <w:t>Materials reviewed: requirements and MVP scope, YouTrack task board, and role justification.</w:t>
+      </w:r>
+    </w:p>
+    <w:p>
+      <w:r>
+        <w:t>Review status: Positive overall feedback received.</w:t>
+      </w:r>
+    </w:p>
+    <w:p>
+      <w:r>
+        <w:t>This is the team’s summary of the feedback received. Area-specific entries distinguish the recorded feedback from the team’s retained plans.</w:t>
       </w:r>
     </w:p>
     <w:p>
       <w:pPr>
-        <w:pStyle w:val="Heading1"/>
+        <w:pStyle w:val="Heading2"/>
       </w:pPr>
       <w:r>
-        <w:t>Evidence and date</w:t>
+        <w:t>Supervisor comments</w:t>
+      </w:r>
+    </w:p>
+    <w:tbl>
+      <w:tblPr>
+        <w:tblStyle w:val="TableGrid"/>
+        <w:tblW w:type="auto" w:w="0"/>
+        <w:tblLook w:firstColumn="1" w:firstRow="1" w:lastColumn="0" w:lastRow="0" w:noHBand="0" w:noVBand="1" w:val="04A0"/>
+      </w:tblPr>
+      <w:tblGrid>
+        <w:gridCol w:w="5112"/>
+        <w:gridCol w:w="5112"/>
+      </w:tblGrid>
+      <w:tr>
+        <w:trPr>
+          <w:cantSplit/>
+        </w:trPr>
+        <w:tc>
+          <w:tcPr>
+            <w:tcW w:type="dxa" w:w="5112"/>
+            <w:shd w:fill="F5D9E3"/>
+          </w:tcPr>
+          <w:p>
+            <w:r>
+              <w:rPr>
+                <w:b/>
+              </w:rPr>
+              <w:t>Area for review</w:t>
+            </w:r>
+          </w:p>
+        </w:tc>
+        <w:tc>
+          <w:tcPr>
+            <w:tcW w:type="dxa" w:w="5112"/>
+            <w:shd w:fill="F5D9E3"/>
+          </w:tcPr>
+          <w:p>
+            <w:r>
+              <w:rPr>
+                <w:b/>
+              </w:rPr>
+              <w:t>Recorded feedback or team response</w:t>
+            </w:r>
+          </w:p>
+        </w:tc>
+      </w:tr>
+      <w:tr>
+        <w:trPr>
+          <w:cantSplit/>
+        </w:trPr>
+        <w:tc>
+          <w:tcPr>
+            <w:tcW w:type="dxa" w:w="5112"/>
+          </w:tcPr>
+          <w:p>
+            <w:r>
+              <w:t>Overall assessment</w:t>
+            </w:r>
+          </w:p>
+        </w:tc>
+        <w:tc>
+          <w:tcPr>
+            <w:tcW w:type="dxa" w:w="5112"/>
+          </w:tcPr>
+          <w:p>
+            <w:r>
+              <w:t>The supervisor gave positive overall feedback on the requirements, task board and role justification.</w:t>
+            </w:r>
+          </w:p>
+        </w:tc>
+      </w:tr>
+      <w:tr>
+        <w:trPr>
+          <w:cantSplit/>
+        </w:trPr>
+        <w:tc>
+          <w:tcPr>
+            <w:tcW w:type="dxa" w:w="5112"/>
+          </w:tcPr>
+          <w:p>
+            <w:r>
+              <w:t>MVP scope and first deliverable</w:t>
+            </w:r>
+          </w:p>
+        </w:tc>
+        <w:tc>
+          <w:tcPr>
+            <w:tcW w:type="dxa" w:w="5112"/>
+          </w:tcPr>
+          <w:p>
+            <w:r>
+              <w:t>The team retained the proposed MVP scope following the positive overall feedback. No separate detailed comment on this area was recorded.</w:t>
+            </w:r>
+          </w:p>
+        </w:tc>
+      </w:tr>
+      <w:tr>
+        <w:trPr>
+          <w:cantSplit/>
+        </w:trPr>
+        <w:tc>
+          <w:tcPr>
+            <w:tcW w:type="dxa" w:w="5112"/>
+          </w:tcPr>
+          <w:p>
+            <w:r>
+              <w:t>Privacy and local versus server processing</w:t>
+            </w:r>
+          </w:p>
+        </w:tc>
+        <w:tc>
+          <w:tcPr>
+            <w:tcW w:type="dxa" w:w="5112"/>
+          </w:tcPr>
+          <w:p>
+            <w:r>
+              <w:t>No separate detailed comment was recorded. The team retains local processing as the default and explicit consent for optional external checks.</w:t>
+            </w:r>
+          </w:p>
+        </w:tc>
+      </w:tr>
+      <w:tr>
+        <w:trPr>
+          <w:cantSplit/>
+        </w:trPr>
+        <w:tc>
+          <w:tcPr>
+            <w:tcW w:type="dxa" w:w="5112"/>
+          </w:tcPr>
+          <w:p>
+            <w:r>
+              <w:t>Quality and latency targets</w:t>
+            </w:r>
+          </w:p>
+        </w:tc>
+        <w:tc>
+          <w:tcPr>
+            <w:tcW w:type="dxa" w:w="5112"/>
+          </w:tcPr>
+          <w:p>
+            <w:r>
+              <w:t>No separate detailed comment was recorded. F1 &gt;= 0.90 and local latency &lt;= 200 ms remain proposed targets for later evaluation.</w:t>
+            </w:r>
+          </w:p>
+        </w:tc>
+      </w:tr>
+      <w:tr>
+        <w:trPr>
+          <w:cantSplit/>
+        </w:trPr>
+        <w:tc>
+          <w:tcPr>
+            <w:tcW w:type="dxa" w:w="5112"/>
+          </w:tcPr>
+          <w:p>
+            <w:r>
+              <w:t>Responsibilities and schedule</w:t>
+            </w:r>
+          </w:p>
+        </w:tc>
+        <w:tc>
+          <w:tcPr>
+            <w:tcW w:type="dxa" w:w="5112"/>
+          </w:tcPr>
+          <w:p>
+            <w:r>
+              <w:t>The team retained the planned responsibilities and task schedule following the positive overall feedback.</w:t>
+            </w:r>
+          </w:p>
+        </w:tc>
+      </w:tr>
+      <w:tr>
+        <w:trPr>
+          <w:cantSplit/>
+        </w:trPr>
+        <w:tc>
+          <w:tcPr>
+            <w:tcW w:type="dxa" w:w="5112"/>
+          </w:tcPr>
+          <w:p>
+            <w:r>
+              <w:t>Submission format</w:t>
+            </w:r>
+          </w:p>
+        </w:tc>
+        <w:tc>
+          <w:tcPr>
+            <w:tcW w:type="dxa" w:w="5112"/>
+          </w:tcPr>
+          <w:p>
+            <w:r>
+              <w:t>Submit the materials as one consolidated PDF report. Supporting materials may also be included in the GitHub documentation folder.</w:t>
+            </w:r>
+          </w:p>
+        </w:tc>
+      </w:tr>
+    </w:tbl>
+    <w:p>
+      <w:pPr>
+        <w:pStyle w:val="Heading2"/>
+      </w:pPr>
+      <w:r>
+        <w:t>Review outcome</w:t>
       </w:r>
     </w:p>
     <w:p>
       <w:r>
-        <w:t>Team-supplied Telegram screenshot, 24 October 2026. Contact displayed as Ayvar, identified by the team as the supervisor. This is a record of the supplied message, not a signed approval form.</w:t>
-      </w:r>
-    </w:p>
-    <w:p>
-      <w:pPr>
-        <w:pStyle w:val="Heading1"/>
-      </w:pPr>
-      <w:r>
-        <w:t>General feedback — 17:15</w:t>
-      </w:r>
-    </w:p>
-    <w:p>
-      <w:r>
-        <w:t>“Excellent!” — English translation of the visible reply. No detailed technical criticisms or requested scope changes are visible.</w:t>
-      </w:r>
-    </w:p>
-    <w:p>
-      <w:pPr>
-        <w:pStyle w:val="Heading1"/>
-      </w:pPr>
-      <w:r>
-        <w:t>Submission guidance — 17:17</w:t>
-      </w:r>
-    </w:p>
-    <w:p>
-      <w:r>
-        <w:t>Convert the document to PDF and include the materials in the report. The materials may also be placed in a GitHub documentation folder.</w:t>
-      </w:r>
-    </w:p>
-    <w:p>
-      <w:pPr>
-        <w:pStyle w:val="Heading1"/>
-      </w:pPr>
-      <w:r>
-        <w:t>Interpretation</w:t>
-      </w:r>
-    </w:p>
-    <w:p>
-      <w:r>
-        <w:t>The response is recorded as general positive feedback and format guidance. It does not establish detailed approval of performance targets, completion of implementation, or satisfaction of every school requirement.</w:t>
-      </w:r>
-    </w:p>
-    <w:p>
-      <w:pPr>
-        <w:pStyle w:val="Heading1"/>
-      </w:pPr>
-      <w:r>
-        <w:t>Evidence location</w:t>
-      </w:r>
-    </w:p>
-    <w:p>
-      <w:r>
-        <w:t>Consolidated report, section 11 and Appendix C; repository/docs/evidence/supervisor-feedback-24Oct2026.jpeg.</w:t>
+        <w:t>The team retained the MVP scope and responsibilities and consolidated the materials into the final PDF. Detailed technical validation and implementation evaluation remain planned work.</w:t>
       </w:r>
     </w:p>
     <w:sectPr>
       <w:pgSz w:w="12240" w:h="15840"/>
-      <w:pgMar w:top="1440" w:right="1800" w:bottom="1440" w:left="1800" w:header="720" w:footer="720" w:gutter="0"/>
+      <w:pgMar w:top="936" w:right="1008" w:bottom="936" w:left="1008" w:header="720" w:footer="720" w:gutter="0"/>
       <w:cols w:space="720"/>
       <w:docGrid w:linePitch="360"/>
     </w:sectPr>
@@ -465,9 +633,11 @@
     <w:name w:val="Normal"/>
     <w:qFormat/>
     <w:rsid w:val="00FC693F"/>
+    <w:pPr>
+      <w:spacing w:after="100"/>
+    </w:pPr>
     <w:rPr>
-      <w:rFonts w:ascii="Arial" w:hAnsi="Arial"/>
-      <w:color w:val="000000"/>
+      <w:rFonts w:ascii="Calibri" w:hAnsi="Calibri"/>
       <w:sz w:val="20"/>
     </w:rPr>
   </w:style>
@@ -530,12 +700,13 @@
       <w:outlineLvl w:val="0"/>
     </w:pPr>
     <w:rPr>
-      <w:rFonts w:asciiTheme="majorHAnsi" w:eastAsiaTheme="majorEastAsia" w:hAnsiTheme="majorHAnsi" w:cstheme="majorBidi" w:ascii="Arial" w:hAnsi="Arial"/>
+      <w:rFonts w:asciiTheme="majorHAnsi" w:eastAsiaTheme="majorEastAsia" w:hAnsiTheme="majorHAnsi" w:cstheme="majorBidi"/>
       <w:b/>
       <w:bCs/>
       <w:color w:val="000000"/>
       <w:sz w:val="28"/>
       <w:szCs w:val="28"/>
+      <w:u w:val="none"/>
     </w:rPr>
   </w:style>
   <w:style w:type="paragraph" w:styleId="Heading2">
@@ -557,9 +728,10 @@
       <w:rFonts w:asciiTheme="majorHAnsi" w:eastAsiaTheme="majorEastAsia" w:hAnsiTheme="majorHAnsi" w:cstheme="majorBidi"/>
       <w:b/>
       <w:bCs/>
-      <w:color w:val="4F81BD" w:themeColor="accent1"/>
+      <w:color w:val="000000"/>
       <w:sz w:val="26"/>
       <w:szCs w:val="26"/>
+      <w:u w:val="none"/>
     </w:rPr>
   </w:style>
   <w:style w:type="paragraph" w:styleId="Heading3">
@@ -816,12 +988,13 @@
       <w:contextualSpacing/>
     </w:pPr>
     <w:rPr>
-      <w:rFonts w:asciiTheme="majorHAnsi" w:eastAsiaTheme="majorEastAsia" w:hAnsiTheme="majorHAnsi" w:cstheme="majorBidi" w:ascii="Arial" w:hAnsi="Arial"/>
+      <w:rFonts w:asciiTheme="majorHAnsi" w:eastAsiaTheme="majorEastAsia" w:hAnsiTheme="majorHAnsi" w:cstheme="majorBidi"/>
       <w:color w:val="000000"/>
       <w:spacing w:val="5"/>
       <w:kern w:val="28"/>
       <w:sz w:val="52"/>
       <w:szCs w:val="52"/>
+      <w:u w:val="none"/>
     </w:rPr>
   </w:style>
   <w:style w:type="character" w:customStyle="1" w:styleId="TitleChar">

</xml_diff>